<commit_message>
Volume 1, Chapter 10: updated lessons
</commit_message>
<xml_diff>
--- a/Volume 1/Chapter 10 - Data Structures/SPA_Vol1_Ch10_Lesson10_1a_Arrays_EXTENDED.docx
+++ b/Volume 1/Chapter 10 - Data Structures/SPA_Vol1_Ch10_Lesson10_1a_Arrays_EXTENDED.docx
@@ -842,7 +842,7 @@
         <w:keepNext/>
       </w:pPr>
       <w:r>
-        <w:t>[profile.default]</w:t>
+        <w:t>[profile.default]  # Remember, the settings forge uses by default.</w:t>
       </w:r>
     </w:p>
     <w:p>
@@ -1365,7 +1365,7 @@
         <w:pStyle w:val="SourceCode"/>
       </w:pPr>
       <w:r>
-        <w:t xml:space="preserve">    ; .data is static storage: in no frame, it lasts the whole run (9.1a).</w:t>
+        <w:t xml:space="preserve">    ; .data is static storage: in no frame, it lasts the whole run (Lesson 9.1a).</w:t>
       </w:r>
     </w:p>
     <w:p>
@@ -1429,6 +1429,7 @@
         <w:pStyle w:val="SourceCode"/>
       </w:pPr>
       <w:r>
+        <w:lastRenderedPageBreak/>
         <w:t xml:space="preserve">    ; gives the count, 6, as C's sizeof ports / sizeof ports[0] does.</w:t>
       </w:r>
     </w:p>
@@ -2623,7 +2624,7 @@
         <w:pStyle w:val="SourceCode"/>
       </w:pPr>
       <w:r>
-        <w:t xml:space="preserve">    ; .data is static storage: in no frame, it lasts the whole run (9.1a).</w:t>
+        <w:t xml:space="preserve">    ; .data is static storage: in no frame, it lasts the whole run (Lesson 9.1a).</w:t>
       </w:r>
     </w:p>
     <w:p>
@@ -4165,15 +4166,15 @@
         <w:pStyle w:val="SourceCode"/>
       </w:pPr>
       <w:r>
-        <w:t xml:space="preserve">    ; Remember, an array's items sit side by side, so item i starts i</w:t>
-      </w:r>
-    </w:p>
-    <w:p>
-      <w:pPr>
-        <w:pStyle w:val="SourceCode"/>
-      </w:pPr>
-      <w:r>
-        <w:t xml:space="preserve">    ; times the item size from the start. dw items take 2 bytes each.</w:t>
+        <w:t xml:space="preserve">    ; Remember, dw items sit side by side, 2 bytes each, so item i starts</w:t>
+      </w:r>
+    </w:p>
+    <w:p>
+      <w:pPr>
+        <w:pStyle w:val="SourceCode"/>
+      </w:pPr>
+      <w:r>
+        <w:t xml:space="preserve">    ; at i * 2; $ - ports measures the 12 bytes, and 12 / 2 gives the count.</w:t>
       </w:r>
     </w:p>
     <w:p>
@@ -6044,15 +6045,15 @@
         <w:pStyle w:val="SourceCode"/>
       </w:pPr>
       <w:r>
-        <w:t xml:space="preserve">    ; Remember, an array's items sit side by side, so item i starts i</w:t>
-      </w:r>
-    </w:p>
-    <w:p>
-      <w:pPr>
-        <w:pStyle w:val="SourceCode"/>
-      </w:pPr>
-      <w:r>
-        <w:t xml:space="preserve">    ; times the item size from the start. dw items take 2 bytes each.</w:t>
+        <w:t xml:space="preserve">    ; Remember, dw items sit side by side, 2 bytes each, so item i starts</w:t>
+      </w:r>
+    </w:p>
+    <w:p>
+      <w:pPr>
+        <w:pStyle w:val="SourceCode"/>
+      </w:pPr>
+      <w:r>
+        <w:t xml:space="preserve">    ; at i * 2; $ - ports measures the 12 bytes, and 12 / 2 gives the count.</w:t>
       </w:r>
     </w:p>
     <w:p>
@@ -8235,39 +8236,39 @@
         <w:pStyle w:val="SourceCode"/>
       </w:pPr>
       <w:r>
-        <w:t>// Prints "Ports:" and every port on one line. &amp;[u16] is a slice: a view</w:t>
-      </w:r>
-    </w:p>
-    <w:p>
-      <w:pPr>
-        <w:pStyle w:val="SourceCode"/>
-      </w:pPr>
-      <w:r>
-        <w:t>// of u16 items side by side, which holds only where they start and how</w:t>
-      </w:r>
-    </w:p>
-    <w:p>
-      <w:pPr>
-        <w:pStyle w:val="SourceCode"/>
-      </w:pPr>
-      <w:r>
-        <w:t>// many there are, the same address and count a C function receives.</w:t>
-      </w:r>
-    </w:p>
-    <w:p>
-      <w:pPr>
-        <w:pStyle w:val="SourceCode"/>
-      </w:pPr>
-      <w:r>
-        <w:t>// &amp;ports lends any array of u16 as a slice, whatever its length, and</w:t>
-      </w:r>
-    </w:p>
-    <w:p>
-      <w:pPr>
-        <w:pStyle w:val="SourceCode"/>
-      </w:pPr>
-      <w:r>
-        <w:t>// nothing is copied. Remember, &amp; lends read-only.</w:t>
+        <w:t>// Prints "Ports:" and every port on one line. Remember, a slice parameter</w:t>
+      </w:r>
+    </w:p>
+    <w:p>
+      <w:pPr>
+        <w:pStyle w:val="SourceCode"/>
+      </w:pPr>
+      <w:r>
+        <w:t>// lends items without copying them (Lesson 9.6a). &amp;[u16] is a view of u16</w:t>
+      </w:r>
+    </w:p>
+    <w:p>
+      <w:pPr>
+        <w:pStyle w:val="SourceCode"/>
+      </w:pPr>
+      <w:r>
+        <w:t>// items side by side: it holds only where they start and how many there</w:t>
+      </w:r>
+    </w:p>
+    <w:p>
+      <w:pPr>
+        <w:pStyle w:val="SourceCode"/>
+      </w:pPr>
+      <w:r>
+        <w:t>// are, the same address and count a C function receives, so &amp;ports lends</w:t>
+      </w:r>
+    </w:p>
+    <w:p>
+      <w:pPr>
+        <w:pStyle w:val="SourceCode"/>
+      </w:pPr>
+      <w:r>
+        <w:t>// an array of any length. Remember, &amp; lends read-only.</w:t>
       </w:r>
     </w:p>
     <w:p>
@@ -8474,15 +8475,15 @@
         <w:pStyle w:val="SourceCode"/>
       </w:pPr>
       <w:r>
-        <w:t xml:space="preserve">    // size_of::&lt;u16&gt;() asks the compiler for one item's size in bytes, as</w:t>
-      </w:r>
-    </w:p>
-    <w:p>
-      <w:pPr>
-        <w:pStyle w:val="SourceCode"/>
-      </w:pPr>
-      <w:r>
-        <w:t xml:space="preserve">    // sizeof does in C: a u16 takes 2. Remember, ::&lt;u16&gt; names the type.</w:t>
+        <w:t xml:space="preserve">    // Remember, size_of::&lt;T&gt;() gives the bytes one T takes (Lesson 7.4a),</w:t>
+      </w:r>
+    </w:p>
+    <w:p>
+      <w:pPr>
+        <w:pStyle w:val="SourceCode"/>
+      </w:pPr>
+      <w:r>
+        <w:t xml:space="preserve">    // as sizeof does in C: a u16 takes 2; ::&lt;u16&gt; names the type.</w:t>
       </w:r>
     </w:p>
     <w:p>
@@ -9305,7 +9306,7 @@
         <w:pStyle w:val="SourceCode"/>
       </w:pPr>
       <w:r>
-        <w:t xml:space="preserve">    // times the item size from the start. A u16 is a 16-bit port.</w:t>
+        <w:t xml:space="preserve">    // times the item size; size_of::&lt;u16&gt;() gives that size, 2 bytes.</w:t>
       </w:r>
     </w:p>
     <w:p>
@@ -10056,13 +10057,13 @@
     </w:p>
     <w:p>
       <w:r>
-        <w:t>A tuple, Lesson 2.7a's fixed-size array, is contiguous too: a header word, then one 8-byte word per item, side by side, so element/2 reads an item in one step. But every item takes 8 bytes, so a tuple cannot show 2-byte ports. A binary, the block of raw bytes of Lesson 3.16a, can, and real Erlang code packs fixed-size numbers into binaries for files and network messages. A list is different: a chain of linked items (Lesson 10.3). The programs build the binary with a binary comprehension, &lt;&lt; &lt;&lt;Port:16&gt;&gt; || P</w:t>
-      </w:r>
-      <w:r>
-        <w:t>ort &lt;- List &gt;&gt;: the list comprehension of Lesson 2.7a written with &lt;&lt; &gt;&gt;. For each Port taken from the list, the bit syntax Port:16 adds 16 bits to one new binary, so the six ports sit side by side, 2 bytes each. The comprehension builds the binary while the program runs, so it lives on the process heap (Lesson 9.1a), like every value the program makes. A binary has no [ ], so the programs read an index by matching at its byte offset, and, as with every Erlang value, a binary never changes: an update builds</w:t>
-      </w:r>
-      <w:r>
-        <w:t xml:space="preserve"> a new one.</w:t>
+        <w:t xml:space="preserve">A tuple, Lesson 2.7a's fixed-size array, is contiguous too: a header word, then one 8-byte word per item, side by side, so element/2 reads an item in one step. But every item takes 8 bytes, so a tuple cannot show 2-byte ports. A binary, the block of raw bytes of Lesson 3.16a, can, and real Erlang code packs fixed-size numbers into binaries for files and network messages. A list is different: a chain of linked items (Lesson 10.3a). The programs build the binary with a binary comprehension, &lt;&lt; &lt;&lt;Port:16&gt;&gt; || </w:t>
+      </w:r>
+      <w:r>
+        <w:t>Port &lt;- List &gt;&gt;: the list comprehension of Lesson 2.7a written with &lt;&lt; &gt;&gt;. For each Port taken from the list, the bit syntax Port:16 adds 16 bits to one new binary, so the six ports sit side by side, 2 bytes each. The comprehension builds the binary while the program runs, so it lives on the process heap (Lesson 9.1a), like every value the program makes. A binary has no [ ], so the programs read an index by matching at its byte offset, and, as with every Erlang value, a binary never changes: an update build</w:t>
+      </w:r>
+      <w:r>
+        <w:t>s a new one.</w:t>
       </w:r>
     </w:p>
     <w:p>
@@ -10533,7 +10534,7 @@
         <w:pStyle w:val="SourceCode"/>
       </w:pPr>
       <w:r>
-        <w:t xml:space="preserve">    %% and values live on the process heap (9.1a).</w:t>
+        <w:t xml:space="preserve">    %% and values live on the process heap (Lesson 9.1a).</w:t>
       </w:r>
     </w:p>
     <w:p>
@@ -11785,15 +11786,15 @@
         <w:pStyle w:val="SourceCode"/>
       </w:pPr>
       <w:r>
-        <w:t xml:space="preserve">    %% times the item size from the start. The binary comprehension puts</w:t>
-      </w:r>
-    </w:p>
-    <w:p>
-      <w:pPr>
-        <w:pStyle w:val="SourceCode"/>
-      </w:pPr>
-      <w:r>
-        <w:t xml:space="preserve">    %% each port into 16 bits of one new binary, built on the process heap.</w:t>
+        <w:t xml:space="preserve">    %% times the item size; byte_size div 2 gives the count. The binary</w:t>
+      </w:r>
+    </w:p>
+    <w:p>
+      <w:pPr>
+        <w:pStyle w:val="SourceCode"/>
+      </w:pPr>
+      <w:r>
+        <w:t xml:space="preserve">    %% comprehension packs each port into 16 bits, on the process heap.</w:t>
       </w:r>
     </w:p>
     <w:p>
@@ -11875,7 +11876,7 @@
         <w:pStyle w:val="SourceCode"/>
       </w:pPr>
       <w:r>
-        <w:t xml:space="preserve">    %% These indexes are written in the code and known to be in range.</w:t>
+        <w:t xml:space="preserve">    %% Indexes written here are in range. Remember, an update makes a new binary.</w:t>
       </w:r>
     </w:p>
     <w:p>
@@ -12701,7 +12702,7 @@
         <w:pStyle w:val="SourceCode"/>
       </w:pPr>
       <w:r>
-        <w:t xml:space="preserve">    // Remember, memory lasts one call; storage outlives it (9.2a).</w:t>
+        <w:t xml:space="preserve">    // Remember, memory lasts one call; storage outlives it (Lesson 9.2a).</w:t>
       </w:r>
     </w:p>
     <w:p>
@@ -13559,15 +13560,15 @@
         <w:pStyle w:val="SourceCode"/>
       </w:pPr>
       <w:r>
-        <w:t xml:space="preserve">    // times the item size from the start. Storage packs these 2-byte</w:t>
-      </w:r>
-    </w:p>
-    <w:p>
-      <w:pPr>
-        <w:pStyle w:val="SourceCode"/>
-      </w:pPr>
-      <w:r>
-        <w:t xml:space="preserve">    // ports into one 32-byte slot.</w:t>
+        <w:t xml:space="preserve">    // times the item size; abi.encodePacked of one port gives it, 2.</w:t>
+      </w:r>
+    </w:p>
+    <w:p>
+      <w:pPr>
+        <w:pStyle w:val="SourceCode"/>
+      </w:pPr>
+      <w:r>
+        <w:t xml:space="preserve">    // Storage packs these 2-byte ports into one 32-byte slot.</w:t>
       </w:r>
     </w:p>
     <w:p>
@@ -13588,7 +13589,7 @@
         <w:pStyle w:val="SourceCode"/>
       </w:pPr>
       <w:r>
-        <w:t xml:space="preserve">    // Prints "Ports:" and every port on one line.</w:t>
+        <w:t xml:space="preserve">    // Prints every port. Remember, a storage parameter is the array itself.</w:t>
       </w:r>
     </w:p>
     <w:p>
@@ -16182,31 +16183,31 @@
       </w:rPr>
     </w:lvl>
   </w:abstractNum>
-  <w:num w:numId="1" w16cid:durableId="1365867701">
+  <w:num w:numId="1" w16cid:durableId="1886982094">
     <w:abstractNumId w:val="8"/>
   </w:num>
-  <w:num w:numId="2" w16cid:durableId="737167121">
+  <w:num w:numId="2" w16cid:durableId="717363652">
     <w:abstractNumId w:val="6"/>
   </w:num>
-  <w:num w:numId="3" w16cid:durableId="861361248">
+  <w:num w:numId="3" w16cid:durableId="1242521089">
     <w:abstractNumId w:val="5"/>
   </w:num>
-  <w:num w:numId="4" w16cid:durableId="1177619712">
+  <w:num w:numId="4" w16cid:durableId="815221209">
     <w:abstractNumId w:val="4"/>
   </w:num>
-  <w:num w:numId="5" w16cid:durableId="1481119608">
+  <w:num w:numId="5" w16cid:durableId="83653035">
     <w:abstractNumId w:val="7"/>
   </w:num>
-  <w:num w:numId="6" w16cid:durableId="76556904">
+  <w:num w:numId="6" w16cid:durableId="1819613351">
     <w:abstractNumId w:val="3"/>
   </w:num>
-  <w:num w:numId="7" w16cid:durableId="487523894">
+  <w:num w:numId="7" w16cid:durableId="124203211">
     <w:abstractNumId w:val="2"/>
   </w:num>
-  <w:num w:numId="8" w16cid:durableId="1538812063">
+  <w:num w:numId="8" w16cid:durableId="1486122895">
     <w:abstractNumId w:val="1"/>
   </w:num>
-  <w:num w:numId="9" w16cid:durableId="1739085928">
+  <w:num w:numId="9" w16cid:durableId="1350989204">
     <w:abstractNumId w:val="0"/>
   </w:num>
 </w:numbering>

</xml_diff>